<commit_message>
Update Qualify or where-When using windows function which will work better.docx
</commit_message>
<xml_diff>
--- a/Qualify or where-When using windows function which will work better.docx
+++ b/Qualify or where-When using windows function which will work better.docx
@@ -104,11 +104,7 @@
         <w:t>WHERE amount &gt; 100;</w:t>
       </w:r>
     </w:p>
-    <w:p>
-      <w:r>
-        <w:t>Show more lines</w:t>
-      </w:r>
-    </w:p>
+    <w:p/>
     <w:p>
       <w:r>
         <w:pict w14:anchorId="561A683F">
@@ -174,30 +170,53 @@
       </w:r>
     </w:p>
     <w:p>
-      <w:r>
+      <w:pPr>
+        <w:rPr>
+          <w:highlight w:val="cyan"/>
+        </w:rPr>
+      </w:pPr>
+      <w:r>
+        <w:rPr>
+          <w:highlight w:val="cyan"/>
+        </w:rPr>
         <w:t>SELECT *,</w:t>
       </w:r>
     </w:p>
     <w:p>
-      <w:r>
+      <w:pPr>
+        <w:rPr>
+          <w:highlight w:val="cyan"/>
+        </w:rPr>
+      </w:pPr>
+      <w:r>
+        <w:rPr>
+          <w:highlight w:val="cyan"/>
+        </w:rPr>
         <w:t>ROW_NUMBER() OVER (PARTITION BY customer_id ORDER BY sales DESC) AS rn</w:t>
       </w:r>
     </w:p>
     <w:p>
-      <w:r>
+      <w:pPr>
+        <w:rPr>
+          <w:highlight w:val="cyan"/>
+        </w:rPr>
+      </w:pPr>
+      <w:r>
+        <w:rPr>
+          <w:highlight w:val="cyan"/>
+        </w:rPr>
         <w:t>FROM sales</w:t>
       </w:r>
     </w:p>
     <w:p>
       <w:r>
+        <w:rPr>
+          <w:highlight w:val="cyan"/>
+        </w:rPr>
         <w:t>QUALIFY rn = 1;</w:t>
       </w:r>
     </w:p>
-    <w:p>
-      <w:r>
-        <w:t>Show more lines</w:t>
-      </w:r>
-    </w:p>
+    <w:p/>
     <w:p>
       <w:r>
         <w:pict w14:anchorId="4E1E1785">
@@ -299,11 +318,7 @@
         <w:t>WHERE dept = 'IT';</w:t>
       </w:r>
     </w:p>
-    <w:p>
-      <w:r>
-        <w:t>Show more lines</w:t>
-      </w:r>
-    </w:p>
+    <w:p/>
     <w:p>
       <w:r>
         <w:rPr>
@@ -444,11 +459,7 @@
         <w:t>QUALIFY rn = 1;</w:t>
       </w:r>
     </w:p>
-    <w:p>
-      <w:r>
-        <w:t>Show more lines</w:t>
-      </w:r>
-    </w:p>
+    <w:p/>
     <w:p>
       <w:r>
         <w:rPr>
@@ -528,11 +539,7 @@
         <w:t>WHERE rn = 1;</w:t>
       </w:r>
     </w:p>
-    <w:p>
-      <w:r>
-        <w:t>Show more lines</w:t>
-      </w:r>
-    </w:p>
+    <w:p/>
     <w:p>
       <w:r>
         <w:t>QUALIFY simplifies this.</w:t>
@@ -580,11 +587,7 @@
         <w:t>QUALIFY -&gt; after window computation</w:t>
       </w:r>
     </w:p>
-    <w:p>
-      <w:r>
-        <w:t>Show more lines</w:t>
-      </w:r>
-    </w:p>
+    <w:p/>
     <w:p>
       <w:r>
         <w:t>So:</w:t>
@@ -632,11 +635,7 @@
         <w:t>then QUALIFY for window-function filtering.</w:t>
       </w:r>
     </w:p>
-    <w:p>
-      <w:r>
-        <w:t>Show more lines</w:t>
-      </w:r>
-    </w:p>
+    <w:p/>
     <w:p>
       <w:r>
         <w:t>Example:</w:t>
@@ -673,11 +672,7 @@
         <w:t>QUALIFY rn = 1;</w:t>
       </w:r>
     </w:p>
-    <w:p>
-      <w:r>
-        <w:t>Show more lines</w:t>
-      </w:r>
-    </w:p>
+    <w:p/>
     <w:p>
       <w:r>
         <w:t>This is usually optimal.</w:t>
@@ -749,11 +744,7 @@
         <w:t>FROM → WHERE → WINDOW FUNCTIONS → QUALIFY</w:t>
       </w:r>
     </w:p>
-    <w:p>
-      <w:r>
-        <w:t>Show more lines</w:t>
-      </w:r>
-    </w:p>
+    <w:p/>
     <w:p>
       <w:pPr>
         <w:rPr>
@@ -799,11 +790,7 @@
         <w:t>QUALIFY rn = 1;</w:t>
       </w:r>
     </w:p>
-    <w:p>
-      <w:r>
-        <w:t>Show more lines</w:t>
-      </w:r>
-    </w:p>
+    <w:p/>
     <w:p>
       <w:r>
         <w:rPr>
@@ -1004,11 +991,7 @@
         <w:t>``</w:t>
       </w:r>
     </w:p>
-    <w:p>
-      <w:r>
-        <w:t>Show more lines</w:t>
-      </w:r>
-    </w:p>
+    <w:p/>
     <w:p>
       <w:r>
         <w:rPr>
@@ -1055,11 +1038,7 @@
         <w:t>WHERE salary &gt; 5000;</w:t>
       </w:r>
     </w:p>
-    <w:p>
-      <w:r>
-        <w:t>Show more lines</w:t>
-      </w:r>
-    </w:p>
+    <w:p/>
     <w:p>
       <w:r>
         <w:rPr>
@@ -1331,11 +1310,7 @@
         <w:t>WHERE rn = 1;</w:t>
       </w:r>
     </w:p>
-    <w:p>
-      <w:r>
-        <w:t>Show more lines</w:t>
-      </w:r>
-    </w:p>
+    <w:p/>
     <w:p>
       <w:r>
         <w:pict w14:anchorId="27FF3B51">

</xml_diff>